<commit_message>
CV: 7+ years in IT delivery
Same wording as tower.bodco.pm and the GitHub profile. PDF and DOCX regenerated (EN and UK).

Co-Authored-By: Claude Opus 5.5 <noreply@anthropic.com>
Claude-Session: https://claude.ai/code/session_01AyXHabpVdM5WQMoETAKPDS
</commit_message>
<xml_diff>
--- a/public/cv/bohdan-n-senior-project-manager-cv-uk.docx
+++ b/public/cv/bohdan-n-senior-project-manager-cv-uk.docx
@@ -52,7 +52,7 @@
       <w:pPr>
         <w:spacing w:after="60"/>
       </w:pPr>
-      <w:hyperlink w:history="1" r:id="rIdrxhwrdrhqoc5solq7hyga">
+      <w:hyperlink w:history="1" r:id="rIdy0dtu-avhzttsa2wvkhmu">
         <w:r>
           <w:rPr>
             <w:rStyle w:val="Hyperlink"/>
@@ -79,7 +79,7 @@
         </w:rPr>
         <w:t xml:space="preserve">Telegram </w:t>
       </w:r>
-      <w:hyperlink w:history="1" r:id="rIdo_mfxrmecyk1yyi7ugu9d">
+      <w:hyperlink w:history="1" r:id="rIdmthshzhbsd-f_qpdgldwa">
         <w:r>
           <w:rPr>
             <w:rStyle w:val="Hyperlink"/>
@@ -98,7 +98,7 @@
         </w:rPr>
         <w:t xml:space="preserve"> · </w:t>
       </w:r>
-      <w:hyperlink w:history="1" r:id="rId8incgadc0o6h9clswknar">
+      <w:hyperlink w:history="1" r:id="rIdqfgp2m1wp6lbpss7srs3o">
         <w:r>
           <w:rPr>
             <w:rStyle w:val="Hyperlink"/>
@@ -117,7 +117,7 @@
         </w:rPr>
         <w:t xml:space="preserve"> · </w:t>
       </w:r>
-      <w:hyperlink w:history="1" r:id="rId41cslhx6ta2bvciwwafoy">
+      <w:hyperlink w:history="1" r:id="rIdifresfs3tk78c9d8mwvmb">
         <w:r>
           <w:rPr>
             <w:rStyle w:val="Hyperlink"/>
@@ -136,7 +136,7 @@
         </w:rPr>
         <w:t xml:space="preserve"> · </w:t>
       </w:r>
-      <w:hyperlink w:history="1" r:id="rIdjkuxnnz3qf5blct3opg6b">
+      <w:hyperlink w:history="1" r:id="rIdrhx187ywedgsr15ukrvgx">
         <w:r>
           <w:rPr>
             <w:rStyle w:val="Hyperlink"/>
@@ -180,7 +180,7 @@
           <w:sz w:val="21"/>
           <w:szCs w:val="21"/>
         </w:rPr>
-        <w:t xml:space="preserve">Senior Project Manager, майже 7 років в IT delivery (з 2019 року). Прийняв платіжний фінтех-продукт enterprise-клієнта з Латинської Америки з нечітким скоупом після продажу і вивів його в продакшн, де ним користуються 50 000+ людей. Вів крос-функціональну команду з 13 людей до повного handover. Працюю за Agile, Scrum, Kanban, Waterfall і гібридними моделями, на fixed-price і T&amp;M контрактах. Автор PM Control Tower, open-source фреймворку для AI-assisted project management.</w:t>
+        <w:t xml:space="preserve">Senior Project Manager, 7+ років в IT delivery (з 2019 року). Прийняв платіжний фінтех-продукт enterprise-клієнта з Латинської Америки з нечітким скоупом після продажу і вивів його в продакшн, де ним користуються 50 000+ людей. Вів крос-функціональну команду з 13 людей до повного handover. Працюю за Agile, Scrum, Kanban, Waterfall і гібридними моделями, на fixed-price і T&amp;M контрактах. Автор PM Control Tower, open-source фреймворку для AI-assisted project management.</w:t>
       </w:r>
     </w:p>
     <w:p>
@@ -781,7 +781,7 @@
         </w:rPr>
         <w:t xml:space="preserve"> · Open source (MIT) · v1.6.1 beta · </w:t>
       </w:r>
-      <w:hyperlink w:history="1" r:id="rIdswhidvevedzelennia5pg">
+      <w:hyperlink w:history="1" r:id="rId9lsjljm7_6mew97vh6mic">
         <w:r>
           <w:rPr>
             <w:rStyle w:val="Hyperlink"/>
@@ -800,7 +800,7 @@
         </w:rPr>
         <w:t xml:space="preserve"> · </w:t>
       </w:r>
-      <w:hyperlink w:history="1" r:id="rIdpqxpnwvvxgcz7fengfcou">
+      <w:hyperlink w:history="1" r:id="rId8uvk3-4aup-f5_kew_xkx">
         <w:r>
           <w:rPr>
             <w:rStyle w:val="Hyperlink"/>

</xml_diff>

<commit_message>
CV: 2019-2022 role shown as Remote (EN and UK), regenerate PDF and Word
</commit_message>
<xml_diff>
--- a/public/cv/bohdan-n-senior-project-manager-cv-uk.docx
+++ b/public/cv/bohdan-n-senior-project-manager-cv-uk.docx
@@ -52,7 +52,7 @@
       <w:pPr>
         <w:spacing w:after="60"/>
       </w:pPr>
-      <w:hyperlink w:history="1" r:id="rIdy0dtu-avhzttsa2wvkhmu">
+      <w:hyperlink w:history="1" r:id="rIdctabog4qhzwtvkmwrmc9d">
         <w:r>
           <w:rPr>
             <w:rStyle w:val="Hyperlink"/>
@@ -79,7 +79,7 @@
         </w:rPr>
         <w:t xml:space="preserve">Telegram </w:t>
       </w:r>
-      <w:hyperlink w:history="1" r:id="rIdmthshzhbsd-f_qpdgldwa">
+      <w:hyperlink w:history="1" r:id="rIdjhu0h-qm0qt3n-niscv9y">
         <w:r>
           <w:rPr>
             <w:rStyle w:val="Hyperlink"/>
@@ -98,7 +98,7 @@
         </w:rPr>
         <w:t xml:space="preserve"> · </w:t>
       </w:r>
-      <w:hyperlink w:history="1" r:id="rIdqfgp2m1wp6lbpss7srs3o">
+      <w:hyperlink w:history="1" r:id="rIdh4xud3ikpvviqedp2fa1w">
         <w:r>
           <w:rPr>
             <w:rStyle w:val="Hyperlink"/>
@@ -117,7 +117,7 @@
         </w:rPr>
         <w:t xml:space="preserve"> · </w:t>
       </w:r>
-      <w:hyperlink w:history="1" r:id="rIdifresfs3tk78c9d8mwvmb">
+      <w:hyperlink w:history="1" r:id="rIdwnldm2lys0udovepy3cql">
         <w:r>
           <w:rPr>
             <w:rStyle w:val="Hyperlink"/>
@@ -136,7 +136,7 @@
         </w:rPr>
         <w:t xml:space="preserve"> · </w:t>
       </w:r>
-      <w:hyperlink w:history="1" r:id="rIdrhx187ywedgsr15ukrvgx">
+      <w:hyperlink w:history="1" r:id="rId_apcdaazu0cuczhjpiq8n">
         <w:r>
           <w:rPr>
             <w:rStyle w:val="Hyperlink"/>
@@ -590,7 +590,7 @@
           <w:sz w:val="19"/>
           <w:szCs w:val="19"/>
         </w:rPr>
-        <w:t xml:space="preserve">2019 - 2022 · клієнти зі США</w:t>
+        <w:t xml:space="preserve">2019 - 2022 · Віддалено</w:t>
       </w:r>
     </w:p>
     <w:p>
@@ -781,7 +781,7 @@
         </w:rPr>
         <w:t xml:space="preserve"> · Open source (MIT) · v1.6.1 beta · </w:t>
       </w:r>
-      <w:hyperlink w:history="1" r:id="rId9lsjljm7_6mew97vh6mic">
+      <w:hyperlink w:history="1" r:id="rId4llx8bxj6wdmsvry6nxk1">
         <w:r>
           <w:rPr>
             <w:rStyle w:val="Hyperlink"/>
@@ -800,7 +800,7 @@
         </w:rPr>
         <w:t xml:space="preserve"> · </w:t>
       </w:r>
-      <w:hyperlink w:history="1" r:id="rId8uvk3-4aup-f5_kew_xkx">
+      <w:hyperlink w:history="1" r:id="rIddqhaipbjapqvxkin4zowb">
         <w:r>
           <w:rPr>
             <w:rStyle w:val="Hyperlink"/>

</xml_diff>

<commit_message>
CV and Home: drop the call add-on from the Control Tower description, regenerate PDF and Word
</commit_message>
<xml_diff>
--- a/public/cv/bohdan-n-senior-project-manager-cv-uk.docx
+++ b/public/cv/bohdan-n-senior-project-manager-cv-uk.docx
@@ -52,7 +52,7 @@
       <w:pPr>
         <w:spacing w:after="60"/>
       </w:pPr>
-      <w:hyperlink w:history="1" r:id="rIdctabog4qhzwtvkmwrmc9d">
+      <w:hyperlink w:history="1" r:id="rIdq1v3o7jrynsyoz1nmnxx3">
         <w:r>
           <w:rPr>
             <w:rStyle w:val="Hyperlink"/>
@@ -79,7 +79,7 @@
         </w:rPr>
         <w:t xml:space="preserve">Telegram </w:t>
       </w:r>
-      <w:hyperlink w:history="1" r:id="rIdjhu0h-qm0qt3n-niscv9y">
+      <w:hyperlink w:history="1" r:id="rId9wzr8qfowyajalsk1segv">
         <w:r>
           <w:rPr>
             <w:rStyle w:val="Hyperlink"/>
@@ -98,7 +98,7 @@
         </w:rPr>
         <w:t xml:space="preserve"> · </w:t>
       </w:r>
-      <w:hyperlink w:history="1" r:id="rIdh4xud3ikpvviqedp2fa1w">
+      <w:hyperlink w:history="1" r:id="rIdnlgwnqr-eqlglq78smnc-">
         <w:r>
           <w:rPr>
             <w:rStyle w:val="Hyperlink"/>
@@ -117,7 +117,7 @@
         </w:rPr>
         <w:t xml:space="preserve"> · </w:t>
       </w:r>
-      <w:hyperlink w:history="1" r:id="rIdwnldm2lys0udovepy3cql">
+      <w:hyperlink w:history="1" r:id="rIdqielfqs4vulre524pobww">
         <w:r>
           <w:rPr>
             <w:rStyle w:val="Hyperlink"/>
@@ -136,7 +136,7 @@
         </w:rPr>
         <w:t xml:space="preserve"> · </w:t>
       </w:r>
-      <w:hyperlink w:history="1" r:id="rId_apcdaazu0cuczhjpiq8n">
+      <w:hyperlink w:history="1" r:id="rIdp2tyoahbcdlwft5y2vnhw">
         <w:r>
           <w:rPr>
             <w:rStyle w:val="Hyperlink"/>
@@ -781,7 +781,7 @@
         </w:rPr>
         <w:t xml:space="preserve"> · Open source (MIT) · v1.6.1 beta · </w:t>
       </w:r>
-      <w:hyperlink w:history="1" r:id="rId4llx8bxj6wdmsvry6nxk1">
+      <w:hyperlink w:history="1" r:id="rId9vxhkwlc02yluypesw6cv">
         <w:r>
           <w:rPr>
             <w:rStyle w:val="Hyperlink"/>
@@ -800,7 +800,7 @@
         </w:rPr>
         <w:t xml:space="preserve"> · </w:t>
       </w:r>
-      <w:hyperlink w:history="1" r:id="rIddqhaipbjapqvxkin4zowb">
+      <w:hyperlink w:history="1" r:id="rIdsq2zbzdutxp_yc2iu_1ed">
         <w:r>
           <w:rPr>
             <w:rStyle w:val="Hyperlink"/>
@@ -822,7 +822,7 @@
           <w:sz w:val="21"/>
           <w:szCs w:val="21"/>
         </w:rPr>
-        <w:t xml:space="preserve">Claude-плагін і Notion-шаблон для проєктних менеджерів: 22 Claude skills, не прив’язані до проєкту, Notion-хаб з 11 пов’язаних баз і один конфіг-файл на проєкт. Збирає контекст, готує до мітингів, пише чернетки звітів і веде ризики за щоденним, тижневим і місячним розкладом, а під час дзвінків дає підказки. Кожне вихідне повідомлення погоджує людина. Створений і щодня працює на живому клієнтському проєкті.</w:t>
+        <w:t xml:space="preserve">Claude-плагін і Notion-шаблон для проєктних менеджерів: 22 Claude skills, не прив’язані до проєкту, Notion-хаб з 11 пов’язаних баз і один конфіг-файл на проєкт. Збирає контекст, готує до мітингів, пише чернетки звітів і веде ризики за щоденним, тижневим і місячним розкладом. Кожне вихідне повідомлення погоджує людина. Створений і щодня працює на живому клієнтському проєкті.</w:t>
       </w:r>
     </w:p>
     <w:p>

</xml_diff>

<commit_message>
Control Tower block: v1.9, Live Tips, clearer button; CV files regenerated
- The block mentions Live Tips, links GitHub, Notion template and Live Tips in one row,
  "Explore Control Tower" instead of the URL in the button; 21 skills; footer link to Live Tips.
- CV (PDF and Word, EN/UK): v1.9, 21 skills, Live Tips sentence.
- Actions updated to the current majors and pinned by SHA; Dependabot without npm majors.

Co-Authored-By: Claude Opus 5.5 <noreply@anthropic.com>
Claude-Session: https://claude.ai/code/session_011gj7yXV1CHodtL8oe3gkkZ
</commit_message>
<xml_diff>
--- a/public/cv/bohdan-n-senior-project-manager-cv-uk.docx
+++ b/public/cv/bohdan-n-senior-project-manager-cv-uk.docx
@@ -52,7 +52,7 @@
       <w:pPr>
         <w:spacing w:after="60"/>
       </w:pPr>
-      <w:hyperlink w:history="1" r:id="rIdq1v3o7jrynsyoz1nmnxx3">
+      <w:hyperlink w:history="1" r:id="rIdyicetgyyvatow5n97-z87">
         <w:r>
           <w:rPr>
             <w:rStyle w:val="Hyperlink"/>
@@ -79,7 +79,7 @@
         </w:rPr>
         <w:t xml:space="preserve">Telegram </w:t>
       </w:r>
-      <w:hyperlink w:history="1" r:id="rId9wzr8qfowyajalsk1segv">
+      <w:hyperlink w:history="1" r:id="rIdwbsdglmvw3ogv-zifq0o-">
         <w:r>
           <w:rPr>
             <w:rStyle w:val="Hyperlink"/>
@@ -98,7 +98,7 @@
         </w:rPr>
         <w:t xml:space="preserve"> · </w:t>
       </w:r>
-      <w:hyperlink w:history="1" r:id="rIdnlgwnqr-eqlglq78smnc-">
+      <w:hyperlink w:history="1" r:id="rIdk-z_zagax8kk4xkzgzhmb">
         <w:r>
           <w:rPr>
             <w:rStyle w:val="Hyperlink"/>
@@ -117,7 +117,7 @@
         </w:rPr>
         <w:t xml:space="preserve"> · </w:t>
       </w:r>
-      <w:hyperlink w:history="1" r:id="rIdqielfqs4vulre524pobww">
+      <w:hyperlink w:history="1" r:id="rIdk2tnnih-wzkthin2vf9z1">
         <w:r>
           <w:rPr>
             <w:rStyle w:val="Hyperlink"/>
@@ -136,7 +136,7 @@
         </w:rPr>
         <w:t xml:space="preserve"> · </w:t>
       </w:r>
-      <w:hyperlink w:history="1" r:id="rIdp2tyoahbcdlwft5y2vnhw">
+      <w:hyperlink w:history="1" r:id="rId3hssj1xa08d3geqnn4y5v">
         <w:r>
           <w:rPr>
             <w:rStyle w:val="Hyperlink"/>
@@ -779,9 +779,9 @@
           <w:sz w:val="21"/>
           <w:szCs w:val="21"/>
         </w:rPr>
-        <w:t xml:space="preserve"> · Open source (MIT) · v1.6.1 beta · </w:t>
-      </w:r>
-      <w:hyperlink w:history="1" r:id="rId9vxhkwlc02yluypesw6cv">
+        <w:t xml:space="preserve"> · Open source (MIT) · v1.9 beta · </w:t>
+      </w:r>
+      <w:hyperlink w:history="1" r:id="rIdxiusetwwlfpfef-dpfdwz">
         <w:r>
           <w:rPr>
             <w:rStyle w:val="Hyperlink"/>
@@ -800,7 +800,7 @@
         </w:rPr>
         <w:t xml:space="preserve"> · </w:t>
       </w:r>
-      <w:hyperlink w:history="1" r:id="rIdsq2zbzdutxp_yc2iu_1ed">
+      <w:hyperlink w:history="1" r:id="rIdkszpbtlwf9natwdpl16wa">
         <w:r>
           <w:rPr>
             <w:rStyle w:val="Hyperlink"/>
@@ -822,7 +822,7 @@
           <w:sz w:val="21"/>
           <w:szCs w:val="21"/>
         </w:rPr>
-        <w:t xml:space="preserve">Claude-плагін і Notion-шаблон для проєктних менеджерів: 22 Claude skills, не прив’язані до проєкту, Notion-хаб з 11 пов’язаних баз і один конфіг-файл на проєкт. Збирає контекст, готує до мітингів, пише чернетки звітів і веде ризики за щоденним, тижневим і місячним розкладом. Кожне вихідне повідомлення погоджує людина. Створений і щодня працює на живому клієнтському проєкті.</w:t>
+        <w:t xml:space="preserve">Claude-плагін і Notion-шаблон для проєктних менеджерів: 21 Claude skill, не прив’язані до проєкту, Notion-хаб з 11 пов’язаних баз і один конфіг-файл на проєкт. Збирає контекст, готує до мітингів, пише чернетки звітів і веде ризики за щоденним, тижневим і місячним розкладом. Кожне вихідне повідомлення погоджує людина. Live Tips, супутній застосунок для Мака, дає факти і готові речення під час дзвінків і записує нотатки зустрічі в Notion. Створений і щодня працює на живому клієнтському проєкті.</w:t>
       </w:r>
     </w:p>
     <w:p>

</xml_diff>